<commit_message>
Update docx export pipeline and templates
</commit_message>
<xml_diff>
--- a/engine/templates/en_reference.docx
+++ b/engine/templates/en_reference.docx
@@ -446,13 +446,15 @@
     <w:qFormat/>
     <w:rsid w:val="00FC693F"/>
     <w:pPr>
-      <w:spacing w:line="276" w:lineRule="auto" w:before="0" w:after="120"/>
+      <w:spacing w:before="0" w:after="120" w:line="276" w:lineRule="auto"/>
       <w:ind w:firstLine="0"/>
+      <w:jc w:val="left"/>
     </w:pPr>
     <w:rPr>
       <w:rFonts w:ascii="Times New Roman" w:hAnsi="Times New Roman" w:eastAsia="Times New Roman"/>
       <w:color w:val="000000"/>
       <w:sz w:val="22"/>
+      <w:szCs w:val="22"/>
     </w:rPr>
   </w:style>
   <w:style w:type="paragraph" w:styleId="Header">
@@ -510,14 +512,13 @@
     <w:pPr>
       <w:keepNext/>
       <w:keepLines/>
-      <w:pageBreakBefore w:val="0"/>
-      <w:spacing w:before="480" w:after="240" w:line="480" w:lineRule="auto"/>
+      <w:spacing w:before="240" w:after="120" w:line="276" w:lineRule="auto"/>
       <w:ind w:firstLine="0"/>
-      <w:jc w:val="center"/>
+      <w:jc w:val="left"/>
       <w:outlineLvl w:val="0"/>
     </w:pPr>
     <w:rPr>
-      <w:rFonts w:asciiTheme="majorHAnsi" w:eastAsiaTheme="majorEastAsia" w:hAnsiTheme="majorHAnsi" w:cstheme="majorBidi" w:ascii="Times New Roman" w:hAnsi="Times New Roman" w:eastAsia="Times New Roman"/>
+      <w:rFonts w:ascii="Times New Roman" w:hAnsi="Times New Roman" w:eastAsia="Times New Roman"/>
       <w:b/>
       <w:bCs/>
       <w:color w:val="000000"/>
@@ -537,13 +538,13 @@
     <w:pPr>
       <w:keepNext/>
       <w:keepLines/>
-      <w:spacing w:before="360" w:after="120" w:line="480" w:lineRule="auto"/>
+      <w:spacing w:before="200" w:after="80" w:line="276" w:lineRule="auto"/>
       <w:ind w:firstLine="0"/>
       <w:jc w:val="left"/>
       <w:outlineLvl w:val="1"/>
     </w:pPr>
     <w:rPr>
-      <w:rFonts w:asciiTheme="majorHAnsi" w:eastAsiaTheme="majorEastAsia" w:hAnsiTheme="majorHAnsi" w:cstheme="majorBidi" w:ascii="Times New Roman" w:hAnsi="Times New Roman" w:eastAsia="Times New Roman"/>
+      <w:rFonts w:ascii="Times New Roman" w:hAnsi="Times New Roman" w:eastAsia="Times New Roman"/>
       <w:b/>
       <w:bCs/>
       <w:color w:val="000000"/>
@@ -563,18 +564,18 @@
     <w:pPr>
       <w:keepNext/>
       <w:keepLines/>
-      <w:spacing w:before="240" w:after="120" w:line="480" w:lineRule="auto"/>
+      <w:spacing w:before="120" w:after="60" w:line="276" w:lineRule="auto"/>
       <w:ind w:firstLine="0"/>
       <w:jc w:val="left"/>
       <w:outlineLvl w:val="2"/>
     </w:pPr>
     <w:rPr>
-      <w:rFonts w:asciiTheme="majorHAnsi" w:eastAsiaTheme="majorEastAsia" w:hAnsiTheme="majorHAnsi" w:cstheme="majorBidi" w:ascii="Times New Roman" w:hAnsi="Times New Roman" w:eastAsia="Times New Roman"/>
+      <w:rFonts w:ascii="Times New Roman" w:hAnsi="Times New Roman" w:eastAsia="Times New Roman"/>
       <w:b/>
       <w:bCs/>
-      <w:i/>
       <w:color w:val="000000"/>
       <w:sz w:val="24"/>
+      <w:szCs w:val="24"/>
     </w:rPr>
   </w:style>
   <w:style w:type="paragraph" w:styleId="Heading4">
@@ -1267,14 +1268,15 @@
     <w:qFormat/>
     <w:rsid w:val="00FC693F"/>
     <w:pPr>
-      <w:spacing w:line="240" w:lineRule="auto"/>
+      <w:spacing w:before="0" w:after="60" w:line="276" w:lineRule="auto"/>
+      <w:ind w:firstLine="0"/>
+      <w:jc w:val="left"/>
     </w:pPr>
     <w:rPr>
-      <w:b/>
-      <w:bCs/>
-      <w:color w:val="4F81BD" w:themeColor="accent1"/>
-      <w:sz w:val="18"/>
-      <w:szCs w:val="18"/>
+      <w:rFonts w:ascii="Times New Roman" w:hAnsi="Times New Roman" w:eastAsia="Times New Roman"/>
+      <w:color w:val="000000"/>
+      <w:sz w:val="20"/>
+      <w:szCs w:val="20"/>
     </w:rPr>
   </w:style>
   <w:style w:type="character" w:styleId="Strong">
@@ -12171,6 +12173,72 @@
     <w:rPr>
       <w:rFonts w:ascii="Times New Roman" w:hAnsi="Times New Roman"/>
       <w:sz w:val="24"/>
+    </w:rPr>
+  </w:style>
+  <w:style w:type="paragraph" w:customStyle="1" w:styleId="TableNote">
+    <w:name w:val="Table Note"/>
+    <w:basedOn w:val="Normal"/>
+    <w:qFormat/>
+    <w:pPr>
+      <w:spacing w:before="60" w:after="120" w:line="276" w:lineRule="auto"/>
+      <w:ind w:firstLine="0"/>
+      <w:jc w:val="left"/>
+    </w:pPr>
+    <w:rPr>
+      <w:rFonts w:ascii="Times New Roman" w:hAnsi="Times New Roman" w:eastAsia="Times New Roman"/>
+      <w:color w:val="000000"/>
+      <w:sz w:val="18"/>
+      <w:szCs w:val="18"/>
+    </w:rPr>
+  </w:style>
+  <w:style w:type="paragraph" w:customStyle="1" w:styleId="References">
+    <w:name w:val="References"/>
+    <w:basedOn w:val="Normal"/>
+    <w:qFormat/>
+    <w:pPr>
+      <w:spacing w:before="0" w:after="120" w:line="276" w:lineRule="auto"/>
+      <w:ind w:firstLine="0"/>
+      <w:jc w:val="left"/>
+    </w:pPr>
+    <w:rPr>
+      <w:rFonts w:ascii="Times New Roman" w:hAnsi="Times New Roman" w:eastAsia="Times New Roman"/>
+      <w:color w:val="000000"/>
+      <w:sz w:val="22"/>
+      <w:szCs w:val="22"/>
+    </w:rPr>
+  </w:style>
+  <w:style w:type="paragraph" w:customStyle="1" w:styleId="AbstractLabel">
+    <w:name w:val="Abstract Label"/>
+    <w:basedOn w:val="Normal"/>
+    <w:qFormat/>
+    <w:pPr>
+      <w:spacing w:before="0" w:after="120" w:line="276" w:lineRule="auto"/>
+      <w:ind w:firstLine="0"/>
+      <w:jc w:val="left"/>
+    </w:pPr>
+    <w:rPr>
+      <w:rFonts w:ascii="Times New Roman" w:hAnsi="Times New Roman" w:eastAsia="Times New Roman"/>
+      <w:b/>
+      <w:bCs/>
+      <w:color w:val="000000"/>
+      <w:sz w:val="22"/>
+      <w:szCs w:val="22"/>
+    </w:rPr>
+  </w:style>
+  <w:style w:type="paragraph" w:customStyle="1" w:styleId="Keywords">
+    <w:name w:val="Keywords"/>
+    <w:basedOn w:val="Normal"/>
+    <w:qFormat/>
+    <w:pPr>
+      <w:spacing w:before="0" w:after="120" w:line="276" w:lineRule="auto"/>
+      <w:ind w:firstLine="0"/>
+      <w:jc w:val="left"/>
+    </w:pPr>
+    <w:rPr>
+      <w:rFonts w:ascii="Times New Roman" w:hAnsi="Times New Roman" w:eastAsia="Times New Roman"/>
+      <w:color w:val="000000"/>
+      <w:sz w:val="22"/>
+      <w:szCs w:val="22"/>
     </w:rPr>
   </w:style>
 </w:styles>

</xml_diff>